<commit_message>
Add Sprint 3 documentation
</commit_message>
<xml_diff>
--- a/documentation/meetings/Sprint_3_Meeting_Minutes.docx
+++ b/documentation/meetings/Sprint_3_Meeting_Minutes.docx
@@ -6842,12 +6842,6 @@
         <w:gridCol w:w="4535"/>
       </w:tblGrid>
       <w:tr>
-        <w:tblPrEx>
-          <w:tblCellMar>
-            <w:top w:w="0" w:type="dxa"/>
-            <w:bottom w:w="0" w:type="dxa"/>
-          </w:tblCellMar>
-        </w:tblPrEx>
         <w:trPr>
           <w:cantSplit/>
           <w:tblHeader/>
@@ -7029,12 +7023,6 @@
         </w:tc>
       </w:tr>
       <w:tr>
-        <w:tblPrEx>
-          <w:tblCellMar>
-            <w:top w:w="0" w:type="dxa"/>
-            <w:bottom w:w="0" w:type="dxa"/>
-          </w:tblCellMar>
-        </w:tblPrEx>
         <w:trPr>
           <w:cantSplit/>
         </w:trPr>
@@ -7215,12 +7203,6 @@
         </w:tc>
       </w:tr>
       <w:tr>
-        <w:tblPrEx>
-          <w:tblCellMar>
-            <w:top w:w="0" w:type="dxa"/>
-            <w:bottom w:w="0" w:type="dxa"/>
-          </w:tblCellMar>
-        </w:tblPrEx>
         <w:trPr>
           <w:cantSplit/>
         </w:trPr>
@@ -7381,12 +7363,6 @@
         </w:tc>
       </w:tr>
       <w:tr>
-        <w:tblPrEx>
-          <w:tblCellMar>
-            <w:top w:w="0" w:type="dxa"/>
-            <w:bottom w:w="0" w:type="dxa"/>
-          </w:tblCellMar>
-        </w:tblPrEx>
         <w:trPr>
           <w:cantSplit/>
         </w:trPr>
@@ -7547,12 +7523,6 @@
         </w:tc>
       </w:tr>
       <w:tr>
-        <w:tblPrEx>
-          <w:tblCellMar>
-            <w:top w:w="0" w:type="dxa"/>
-            <w:bottom w:w="0" w:type="dxa"/>
-          </w:tblCellMar>
-        </w:tblPrEx>
         <w:trPr>
           <w:cantSplit/>
         </w:trPr>
@@ -7733,12 +7703,6 @@
         </w:tc>
       </w:tr>
       <w:tr>
-        <w:tblPrEx>
-          <w:tblCellMar>
-            <w:top w:w="0" w:type="dxa"/>
-            <w:bottom w:w="0" w:type="dxa"/>
-          </w:tblCellMar>
-        </w:tblPrEx>
         <w:trPr>
           <w:cantSplit/>
         </w:trPr>
@@ -7899,12 +7863,6 @@
         </w:tc>
       </w:tr>
       <w:tr>
-        <w:tblPrEx>
-          <w:tblCellMar>
-            <w:top w:w="0" w:type="dxa"/>
-            <w:bottom w:w="0" w:type="dxa"/>
-          </w:tblCellMar>
-        </w:tblPrEx>
         <w:trPr>
           <w:cantSplit/>
         </w:trPr>
@@ -8065,12 +8023,6 @@
         </w:tc>
       </w:tr>
       <w:tr>
-        <w:tblPrEx>
-          <w:tblCellMar>
-            <w:top w:w="0" w:type="dxa"/>
-            <w:bottom w:w="0" w:type="dxa"/>
-          </w:tblCellMar>
-        </w:tblPrEx>
         <w:trPr>
           <w:cantSplit/>
         </w:trPr>
@@ -8242,12 +8194,6 @@
         </w:tc>
       </w:tr>
       <w:tr>
-        <w:tblPrEx>
-          <w:tblCellMar>
-            <w:top w:w="0" w:type="dxa"/>
-            <w:bottom w:w="0" w:type="dxa"/>
-          </w:tblCellMar>
-        </w:tblPrEx>
         <w:trPr>
           <w:cantSplit/>
         </w:trPr>
@@ -8408,12 +8354,6 @@
         </w:tc>
       </w:tr>
       <w:tr>
-        <w:tblPrEx>
-          <w:tblCellMar>
-            <w:top w:w="0" w:type="dxa"/>
-            <w:bottom w:w="0" w:type="dxa"/>
-          </w:tblCellMar>
-        </w:tblPrEx>
         <w:trPr>
           <w:cantSplit/>
         </w:trPr>
@@ -8572,7 +8512,6 @@
             <w:pPr>
               <w:spacing w:after="30"/>
             </w:pPr>
-            <w:proofErr w:type="gramStart"/>
             <w:r>
               <w:rPr>
                 <w:rFonts w:ascii="Calibri" w:eastAsia="Calibri" w:hAnsi="Calibri" w:cs="Calibri"/>
@@ -8580,28 +8519,12 @@
                 <w:sz w:val="18"/>
                 <w:szCs w:val="18"/>
               </w:rPr>
-              <w:t>Teal</w:t>
-            </w:r>
-            <w:proofErr w:type="gramEnd"/>
-            <w:r>
-              <w:rPr>
-                <w:rFonts w:ascii="Calibri" w:eastAsia="Calibri" w:hAnsi="Calibri" w:cs="Calibri"/>
-                <w:color w:val="3B2A1E"/>
-                <w:sz w:val="18"/>
-                <w:szCs w:val="18"/>
-              </w:rPr>
-              <w:t>: map circle, ranking bar, scatter points</w:t>
+              <w:t>Teal: map circle, ranking bar, scatter points</w:t>
             </w:r>
           </w:p>
         </w:tc>
       </w:tr>
       <w:tr>
-        <w:tblPrEx>
-          <w:tblCellMar>
-            <w:top w:w="0" w:type="dxa"/>
-            <w:bottom w:w="0" w:type="dxa"/>
-          </w:tblCellMar>
-        </w:tblPrEx>
         <w:trPr>
           <w:cantSplit/>
         </w:trPr>
@@ -9879,8 +9802,20 @@
           <w:szCs w:val="21"/>
           <w:lang w:bidi="si-LK"/>
         </w:rPr>
-        <w:t>(Refer to the UI_Design.docx</w:t>
+        <w:t xml:space="preserve">(Refer to the </w:t>
       </w:r>
+      <w:hyperlink r:id="rId8" w:history="1">
+        <w:r>
+          <w:rPr>
+            <w:rStyle w:val="Hyperlink"/>
+            <w:rFonts w:ascii="Iskoola Pota" w:hAnsi="Iskoola Pota" w:cs="Iskoola Pota"/>
+            <w:sz w:val="21"/>
+            <w:szCs w:val="21"/>
+            <w:lang w:bidi="si-LK"/>
+          </w:rPr>
+          <w:t>UI_Design.docx</w:t>
+        </w:r>
+      </w:hyperlink>
       <w:r>
         <w:rPr>
           <w:rFonts w:ascii="Iskoola Pota" w:hAnsi="Iskoola Pota" w:cs="Iskoola Pota" w:hint="cs"/>
@@ -10622,6 +10557,18 @@
       <w:szCs w:val="20"/>
     </w:rPr>
   </w:style>
+  <w:style w:type="character" w:styleId="UnresolvedMention">
+    <w:name w:val="Unresolved Mention"/>
+    <w:basedOn w:val="DefaultParagraphFont"/>
+    <w:uiPriority w:val="99"/>
+    <w:semiHidden/>
+    <w:unhideWhenUsed/>
+    <w:rsid w:val="00C44585"/>
+    <w:rPr>
+      <w:color w:val="605E5C"/>
+      <w:shd w:val="clear" w:color="auto" w:fill="E1DFDD"/>
+    </w:rPr>
+  </w:style>
 </w:styles>
 </file>
 

</xml_diff>

<commit_message>
Add initial interactive dashboard
</commit_message>
<xml_diff>
--- a/documentation/meetings/Sprint_3_Meeting_Minutes.docx
+++ b/documentation/meetings/Sprint_3_Meeting_Minutes.docx
@@ -821,59 +821,13 @@
             <w:vAlign w:val="center"/>
           </w:tcPr>
           <w:p>
-            <w:proofErr w:type="spellStart"/>
-            <w:r>
-              <w:rPr>
-                <w:rFonts w:ascii="Calibri" w:eastAsia="Calibri" w:hAnsi="Calibri" w:cs="Calibri"/>
-                <w:sz w:val="18"/>
-                <w:szCs w:val="18"/>
-              </w:rPr>
-              <w:t>Singappuli</w:t>
-            </w:r>
-            <w:proofErr w:type="spellEnd"/>
-            <w:r>
-              <w:rPr>
-                <w:rFonts w:ascii="Calibri" w:eastAsia="Calibri" w:hAnsi="Calibri" w:cs="Calibri"/>
-                <w:sz w:val="18"/>
-                <w:szCs w:val="18"/>
-              </w:rPr>
-              <w:t xml:space="preserve"> Arachchige </w:t>
-            </w:r>
-            <w:proofErr w:type="spellStart"/>
-            <w:r>
-              <w:rPr>
-                <w:rFonts w:ascii="Calibri" w:eastAsia="Calibri" w:hAnsi="Calibri" w:cs="Calibri"/>
-                <w:sz w:val="18"/>
-                <w:szCs w:val="18"/>
-              </w:rPr>
-              <w:t>Isuru</w:t>
-            </w:r>
-            <w:proofErr w:type="spellEnd"/>
-            <w:r>
-              <w:rPr>
-                <w:rFonts w:ascii="Calibri" w:eastAsia="Calibri" w:hAnsi="Calibri" w:cs="Calibri"/>
-                <w:sz w:val="18"/>
-                <w:szCs w:val="18"/>
-              </w:rPr>
-              <w:t xml:space="preserve"> </w:t>
-            </w:r>
-            <w:proofErr w:type="spellStart"/>
-            <w:r>
-              <w:rPr>
-                <w:rFonts w:ascii="Calibri" w:eastAsia="Calibri" w:hAnsi="Calibri" w:cs="Calibri"/>
-                <w:sz w:val="18"/>
-                <w:szCs w:val="18"/>
-              </w:rPr>
-              <w:t>Dayanga</w:t>
-            </w:r>
-            <w:proofErr w:type="spellEnd"/>
-            <w:r>
-              <w:rPr>
-                <w:rFonts w:ascii="Calibri" w:eastAsia="Calibri" w:hAnsi="Calibri" w:cs="Calibri"/>
-                <w:sz w:val="18"/>
-                <w:szCs w:val="18"/>
-              </w:rPr>
-              <w:t xml:space="preserve"> Samarakoon</w:t>
+            <w:r>
+              <w:rPr>
+                <w:rFonts w:ascii="Calibri" w:eastAsia="Calibri" w:hAnsi="Calibri" w:cs="Calibri"/>
+                <w:sz w:val="18"/>
+                <w:szCs w:val="18"/>
+              </w:rPr>
+              <w:t>Singappuli Arachchige Isuru Dayanga Samarakoon</w:t>
             </w:r>
           </w:p>
         </w:tc>
@@ -2512,25 +2466,7 @@
                 <w:sz w:val="18"/>
                 <w:szCs w:val="18"/>
               </w:rPr>
-              <w:t>Position = geography (</w:t>
-            </w:r>
-            <w:proofErr w:type="spellStart"/>
-            <w:r>
-              <w:rPr>
-                <w:rFonts w:ascii="Calibri" w:eastAsia="Calibri" w:hAnsi="Calibri" w:cs="Calibri"/>
-                <w:sz w:val="18"/>
-                <w:szCs w:val="18"/>
-              </w:rPr>
-              <w:t>lat</w:t>
-            </w:r>
-            <w:proofErr w:type="spellEnd"/>
-            <w:r>
-              <w:rPr>
-                <w:rFonts w:ascii="Calibri" w:eastAsia="Calibri" w:hAnsi="Calibri" w:cs="Calibri"/>
-                <w:sz w:val="18"/>
-                <w:szCs w:val="18"/>
-              </w:rPr>
-              <w:t>/long); bubble size = revenue. Size differences readable but not exaggerated.</w:t>
+              <w:t>Position = geography (lat/long); bubble size = revenue. Size differences readable but not exaggerated.</w:t>
             </w:r>
           </w:p>
         </w:tc>
@@ -3026,7 +2962,63 @@
                 <w:sz w:val="18"/>
                 <w:szCs w:val="18"/>
               </w:rPr>
-              <w:t>Fixed KPI band (revenue, transactions, units sold, per-transaction value) across the top; a shared filter bar (Store / Category / Month) with a Reset button beneath it; heat map and store map side by side, scatter plot full-width below.</w:t>
+              <w:t xml:space="preserve">Fixed KPI band (revenue, transactions, units sold, per-transaction value) across the top; a shared filter bar (Store / Category / Month) with a Reset button beneath it; heat map </w:t>
+            </w:r>
+            <w:r>
+              <w:rPr>
+                <w:rFonts w:ascii="Calibri" w:eastAsia="Calibri" w:hAnsi="Calibri" w:cs="Calibri"/>
+                <w:sz w:val="18"/>
+                <w:szCs w:val="18"/>
+              </w:rPr>
+              <w:t>,</w:t>
+            </w:r>
+            <w:r>
+              <w:rPr>
+                <w:rFonts w:ascii="Calibri" w:eastAsia="Calibri" w:hAnsi="Calibri" w:cs="Calibri"/>
+                <w:sz w:val="18"/>
+                <w:szCs w:val="18"/>
+              </w:rPr>
+              <w:t xml:space="preserve">store map side </w:t>
+            </w:r>
+            <w:r>
+              <w:rPr>
+                <w:rFonts w:ascii="Calibri" w:eastAsia="Calibri" w:hAnsi="Calibri" w:cs="Calibri"/>
+                <w:sz w:val="18"/>
+                <w:szCs w:val="18"/>
+              </w:rPr>
+              <w:t xml:space="preserve">and </w:t>
+            </w:r>
+            <w:r>
+              <w:rPr>
+                <w:rFonts w:ascii="Calibri" w:eastAsia="Calibri" w:hAnsi="Calibri" w:cs="Calibri"/>
+                <w:sz w:val="18"/>
+                <w:szCs w:val="18"/>
+              </w:rPr>
+              <w:t>scatter plot full-width below</w:t>
+            </w:r>
+            <w:r>
+              <w:rPr>
+                <w:rFonts w:ascii="Calibri" w:eastAsia="Calibri" w:hAnsi="Calibri" w:cs="Calibri"/>
+                <w:sz w:val="18"/>
+                <w:szCs w:val="18"/>
+              </w:rPr>
+              <w:t xml:space="preserve"> ,</w:t>
+            </w:r>
+            <w:r>
+              <w:rPr>
+                <w:rFonts w:ascii="Calibri" w:eastAsia="Calibri" w:hAnsi="Calibri" w:cs="Calibri"/>
+                <w:sz w:val="18"/>
+                <w:szCs w:val="18"/>
+              </w:rPr>
+              <w:t>stacked in that order.</w:t>
+            </w:r>
+            <w:r>
+              <w:rPr>
+                <w:rFonts w:ascii="Calibri" w:eastAsia="Calibri" w:hAnsi="Calibri" w:cs="Calibri"/>
+                <w:sz w:val="18"/>
+                <w:szCs w:val="18"/>
+              </w:rPr>
+              <w:t>.</w:t>
             </w:r>
           </w:p>
         </w:tc>
@@ -7121,27 +7113,7 @@
                 <w:sz w:val="18"/>
                 <w:szCs w:val="18"/>
               </w:rPr>
-              <w:t>--</w:t>
-            </w:r>
-            <w:proofErr w:type="spellStart"/>
-            <w:r>
-              <w:rPr>
-                <w:rFonts w:ascii="Calibri" w:eastAsia="Calibri" w:hAnsi="Calibri" w:cs="Calibri"/>
-                <w:color w:val="3B2A1E"/>
-                <w:sz w:val="18"/>
-                <w:szCs w:val="18"/>
-              </w:rPr>
-              <w:t>bg</w:t>
-            </w:r>
-            <w:proofErr w:type="spellEnd"/>
-            <w:r>
-              <w:rPr>
-                <w:rFonts w:ascii="Calibri" w:eastAsia="Calibri" w:hAnsi="Calibri" w:cs="Calibri"/>
-                <w:color w:val="3B2A1E"/>
-                <w:sz w:val="18"/>
-                <w:szCs w:val="18"/>
-              </w:rPr>
-              <w:t>-light</w:t>
+              <w:t>--bg-light</w:t>
             </w:r>
           </w:p>
         </w:tc>
@@ -7621,27 +7593,7 @@
                 <w:sz w:val="18"/>
                 <w:szCs w:val="18"/>
               </w:rPr>
-              <w:t>--</w:t>
-            </w:r>
-            <w:proofErr w:type="spellStart"/>
-            <w:r>
-              <w:rPr>
-                <w:rFonts w:ascii="Calibri" w:eastAsia="Calibri" w:hAnsi="Calibri" w:cs="Calibri"/>
-                <w:color w:val="3B2A1E"/>
-                <w:sz w:val="18"/>
-                <w:szCs w:val="18"/>
-              </w:rPr>
-              <w:t>bg</w:t>
-            </w:r>
-            <w:proofErr w:type="spellEnd"/>
-            <w:r>
-              <w:rPr>
-                <w:rFonts w:ascii="Calibri" w:eastAsia="Calibri" w:hAnsi="Calibri" w:cs="Calibri"/>
-                <w:color w:val="3B2A1E"/>
-                <w:sz w:val="18"/>
-                <w:szCs w:val="18"/>
-              </w:rPr>
-              <w:t>-dark</w:t>
+              <w:t>--bg-dark</w:t>
             </w:r>
           </w:p>
         </w:tc>
@@ -8121,19 +8073,8 @@
                 <w:sz w:val="18"/>
                 <w:szCs w:val="18"/>
               </w:rPr>
-              <w:t>--store-</w:t>
-            </w:r>
-            <w:proofErr w:type="spellStart"/>
-            <w:r>
-              <w:rPr>
-                <w:rFonts w:ascii="Calibri" w:eastAsia="Calibri" w:hAnsi="Calibri" w:cs="Calibri"/>
-                <w:color w:val="3B2A1E"/>
-                <w:sz w:val="18"/>
-                <w:szCs w:val="18"/>
-              </w:rPr>
-              <w:t>hk</w:t>
-            </w:r>
-            <w:proofErr w:type="spellEnd"/>
+              <w:t>--store-hk</w:t>
+            </w:r>
           </w:p>
         </w:tc>
         <w:tc>
@@ -8452,19 +8393,8 @@
                 <w:sz w:val="18"/>
                 <w:szCs w:val="18"/>
               </w:rPr>
-              <w:t>--store-</w:t>
-            </w:r>
-            <w:proofErr w:type="spellStart"/>
-            <w:r>
-              <w:rPr>
-                <w:rFonts w:ascii="Calibri" w:eastAsia="Calibri" w:hAnsi="Calibri" w:cs="Calibri"/>
-                <w:color w:val="3B2A1E"/>
-                <w:sz w:val="18"/>
-                <w:szCs w:val="18"/>
-              </w:rPr>
-              <w:t>lm</w:t>
-            </w:r>
-            <w:proofErr w:type="spellEnd"/>
+              <w:t>--store-lm</w:t>
+            </w:r>
           </w:p>
         </w:tc>
         <w:tc>
@@ -10449,7 +10379,6 @@
   <w:style w:type="character" w:default="1" w:styleId="DefaultParagraphFont">
     <w:name w:val="Default Paragraph Font"/>
     <w:uiPriority w:val="1"/>
-    <w:semiHidden/>
     <w:unhideWhenUsed/>
   </w:style>
   <w:style w:type="table" w:default="1" w:styleId="TableNormal">

</xml_diff>